<commit_message>
handle WFH and HWFH issue in docymentation
</commit_message>
<xml_diff>
--- a/Guide file HR.docx
+++ b/Guide file HR.docx
@@ -52,6 +52,65 @@
       </w:r>
       <w:r>
         <w:t xml:space="preserve"> on clicking Save/Close option in Power Query editor, only those tables will be loaded to Power BI whose Enable Load option is ticked, meaning enabled.</w:t>
+      </w:r>
+    </w:p>
+    <w:p/>
+    <w:p>
+      <w:r>
+        <w:t>Half work from home actually means that the person has done only four hours of work</w:t>
+      </w:r>
+      <w:r>
+        <w:t xml:space="preserve"> (</w:t>
+      </w:r>
+      <w:proofErr w:type="spellStart"/>
+      <w:r>
+        <w:t>vo</w:t>
+      </w:r>
+      <w:proofErr w:type="spellEnd"/>
+      <w:r>
+        <w:t xml:space="preserve"> </w:t>
+      </w:r>
+      <w:proofErr w:type="spellStart"/>
+      <w:r>
+        <w:t>bhi</w:t>
+      </w:r>
+      <w:proofErr w:type="spellEnd"/>
+      <w:r>
+        <w:t xml:space="preserve"> from home)</w:t>
+      </w:r>
+      <w:r>
+        <w:t>. If he has a total of eight hours of work then we will count two half work from home and then we will divide it by two, means tha</w:t>
+      </w:r>
+      <w:r>
+        <w:t xml:space="preserve">t </w:t>
+      </w:r>
+      <w:r>
+        <w:t xml:space="preserve">employee has done two half days of work, which means he has done four hours of work two days. Then we will count these two days as one working day because he has completed </w:t>
+      </w:r>
+      <w:r>
+        <w:t>eight</w:t>
+      </w:r>
+      <w:r>
+        <w:t xml:space="preserve"> hours of work</w:t>
+      </w:r>
+      <w:r>
+        <w:t xml:space="preserve"> in 2 days, </w:t>
+      </w:r>
+      <w:proofErr w:type="spellStart"/>
+      <w:r>
+        <w:t>meansd</w:t>
+      </w:r>
+      <w:proofErr w:type="spellEnd"/>
+      <w:r>
+        <w:t xml:space="preserve"> 1 din ki attendance </w:t>
+      </w:r>
+      <w:proofErr w:type="spellStart"/>
+      <w:r>
+        <w:t>lgi</w:t>
+      </w:r>
+      <w:proofErr w:type="spellEnd"/>
+      <w:r>
+        <w:t xml:space="preserve"> </w:t>
       </w:r>
     </w:p>
     <w:sectPr>

</xml_diff>